<commit_message>
Prompt Engineering Video 2 Completed.
</commit_message>
<xml_diff>
--- a/AI-NOTES/AI-PROMOPT-ENGINEERING-DURGA-SIR.docx
+++ b/AI-NOTES/AI-PROMOPT-ENGINEERING-DURGA-SIR.docx
@@ -1181,6 +1181,1071 @@
       <w:pPr>
         <w:pStyle w:val="NoSpacing"/>
       </w:pPr>
+    </w:p>
+    <w:p>
+      <w:pPr>
+        <w:pStyle w:val="NoSpacing"/>
+      </w:pPr>
+      <w:r>
+        <w:t xml:space="preserve">Video 2:- </w:t>
+      </w:r>
+      <w:r>
+        <w:t xml:space="preserve"> </w:t>
+      </w:r>
+      <w:r>
+        <w:t xml:space="preserve">Prompt Engineering </w:t>
+      </w:r>
+    </w:p>
+    <w:p>
+      <w:pPr>
+        <w:pStyle w:val="NoSpacing"/>
+      </w:pPr>
+      <w:r>
+        <w:t>Video 2</w:t>
+      </w:r>
+    </w:p>
+    <w:p>
+      <w:pPr>
+        <w:pStyle w:val="NoSpacing"/>
+      </w:pPr>
+    </w:p>
+    <w:p>
+      <w:pPr>
+        <w:pStyle w:val="NoSpacing"/>
+      </w:pPr>
+      <w:r>
+        <w:t>https://whatsapp.com/channel/0029Vb7FvGj2kNFn5M7zbB3D/211</w:t>
+      </w:r>
+      <w:r>
+        <w:br/>
+      </w:r>
+      <w:r>
+        <w:br/>
+      </w:r>
+    </w:p>
+    <w:p>
+      <w:pPr>
+        <w:pStyle w:val="NoSpacing"/>
+      </w:pPr>
+      <w:r>
+        <w:t>Prompt Formula:</w:t>
+      </w:r>
+    </w:p>
+    <w:p>
+      <w:pPr>
+        <w:pStyle w:val="NoSpacing"/>
+      </w:pPr>
+      <w:r>
+        <w:t>---------------</w:t>
+      </w:r>
+    </w:p>
+    <w:p>
+      <w:pPr>
+        <w:pStyle w:val="NoSpacing"/>
+      </w:pPr>
+      <w:r>
+        <w:t>RTC CO</w:t>
+      </w:r>
+    </w:p>
+    <w:p>
+      <w:pPr>
+        <w:pStyle w:val="NoSpacing"/>
+      </w:pPr>
+    </w:p>
+    <w:p>
+      <w:pPr>
+        <w:pStyle w:val="NoSpacing"/>
+      </w:pPr>
+      <w:r>
+        <w:t>Role + Task + Context  + Constraints + Output</w:t>
+      </w:r>
+    </w:p>
+    <w:p>
+      <w:pPr>
+        <w:pStyle w:val="NoSpacing"/>
+      </w:pPr>
+    </w:p>
+    <w:p>
+      <w:pPr>
+        <w:pStyle w:val="NoSpacing"/>
+      </w:pPr>
+    </w:p>
+    <w:p>
+      <w:pPr>
+        <w:pStyle w:val="NoSpacing"/>
+      </w:pPr>
+      <w:r>
+        <w:t>1. Role: Who should AI act like?</w:t>
+      </w:r>
+    </w:p>
+    <w:p>
+      <w:pPr>
+        <w:pStyle w:val="NoSpacing"/>
+      </w:pPr>
+      <w:r>
+        <w:t>--------------------------------</w:t>
+      </w:r>
+    </w:p>
+    <w:p>
+      <w:pPr>
+        <w:pStyle w:val="NoSpacing"/>
+      </w:pPr>
+      <w:r>
+        <w:t>What role should AI play?</w:t>
+      </w:r>
+    </w:p>
+    <w:p>
+      <w:pPr>
+        <w:pStyle w:val="NoSpacing"/>
+      </w:pPr>
+    </w:p>
+    <w:p>
+      <w:pPr>
+        <w:pStyle w:val="NoSpacing"/>
+      </w:pPr>
+      <w:r>
+        <w:t>eg:</w:t>
+      </w:r>
+    </w:p>
+    <w:p>
+      <w:pPr>
+        <w:pStyle w:val="NoSpacing"/>
+      </w:pPr>
+      <w:r>
+        <w:t>Act as a Teacher</w:t>
+      </w:r>
+    </w:p>
+    <w:p>
+      <w:pPr>
+        <w:pStyle w:val="NoSpacing"/>
+      </w:pPr>
+      <w:r>
+        <w:t>Act as a HR</w:t>
+      </w:r>
+    </w:p>
+    <w:p>
+      <w:pPr>
+        <w:pStyle w:val="NoSpacing"/>
+      </w:pPr>
+      <w:r>
+        <w:t>Act as an interviewer</w:t>
+      </w:r>
+    </w:p>
+    <w:p>
+      <w:pPr>
+        <w:pStyle w:val="NoSpacing"/>
+      </w:pPr>
+      <w:r>
+        <w:t>Act as a manager</w:t>
+      </w:r>
+    </w:p>
+    <w:p>
+      <w:pPr>
+        <w:pStyle w:val="NoSpacing"/>
+      </w:pPr>
+      <w:r>
+        <w:t>Act as a mentor</w:t>
+      </w:r>
+    </w:p>
+    <w:p>
+      <w:pPr>
+        <w:pStyle w:val="NoSpacing"/>
+      </w:pPr>
+    </w:p>
+    <w:p>
+      <w:pPr>
+        <w:pStyle w:val="NoSpacing"/>
+      </w:pPr>
+      <w:r>
+        <w:t>Role gives direction to the AI.</w:t>
+      </w:r>
+    </w:p>
+    <w:p>
+      <w:pPr>
+        <w:pStyle w:val="NoSpacing"/>
+      </w:pPr>
+      <w:r>
+        <w:t>Without role, AI gives general answer.</w:t>
+      </w:r>
+    </w:p>
+    <w:p>
+      <w:pPr>
+        <w:pStyle w:val="NoSpacing"/>
+      </w:pPr>
+    </w:p>
+    <w:p>
+      <w:pPr>
+        <w:pStyle w:val="NoSpacing"/>
+      </w:pPr>
+      <w:r>
+        <w:t>2. Task - What should AI do?</w:t>
+      </w:r>
+    </w:p>
+    <w:p>
+      <w:pPr>
+        <w:pStyle w:val="NoSpacing"/>
+      </w:pPr>
+      <w:r>
+        <w:t>----------------------------</w:t>
+      </w:r>
+    </w:p>
+    <w:p>
+      <w:pPr>
+        <w:pStyle w:val="NoSpacing"/>
+      </w:pPr>
+      <w:r>
+        <w:t xml:space="preserve">  what work you want AI to do</w:t>
+      </w:r>
+    </w:p>
+    <w:p>
+      <w:pPr>
+        <w:pStyle w:val="NoSpacing"/>
+      </w:pPr>
+    </w:p>
+    <w:p>
+      <w:pPr>
+        <w:pStyle w:val="NoSpacing"/>
+      </w:pPr>
+      <w:r>
+        <w:t>eg:</w:t>
+      </w:r>
+    </w:p>
+    <w:p>
+      <w:pPr>
+        <w:pStyle w:val="NoSpacing"/>
+      </w:pPr>
+      <w:r>
+        <w:t>Explain Python</w:t>
+      </w:r>
+    </w:p>
+    <w:p>
+      <w:pPr>
+        <w:pStyle w:val="NoSpacing"/>
+      </w:pPr>
+      <w:r>
+        <w:t>Write email</w:t>
+      </w:r>
+    </w:p>
+    <w:p>
+      <w:pPr>
+        <w:pStyle w:val="NoSpacing"/>
+      </w:pPr>
+      <w:r>
+        <w:t>Create resume</w:t>
+      </w:r>
+    </w:p>
+    <w:p>
+      <w:pPr>
+        <w:pStyle w:val="NoSpacing"/>
+      </w:pPr>
+      <w:r>
+        <w:t>Ask interview question</w:t>
+      </w:r>
+    </w:p>
+    <w:p>
+      <w:pPr>
+        <w:pStyle w:val="NoSpacing"/>
+      </w:pPr>
+    </w:p>
+    <w:p>
+      <w:pPr>
+        <w:pStyle w:val="NoSpacing"/>
+      </w:pPr>
+      <w:r>
+        <w:lastRenderedPageBreak/>
+        <w:t>Task gives job to AI.</w:t>
+      </w:r>
+    </w:p>
+    <w:p>
+      <w:pPr>
+        <w:pStyle w:val="NoSpacing"/>
+      </w:pPr>
+    </w:p>
+    <w:p>
+      <w:pPr>
+        <w:pStyle w:val="NoSpacing"/>
+      </w:pPr>
+    </w:p>
+    <w:p>
+      <w:pPr>
+        <w:pStyle w:val="NoSpacing"/>
+      </w:pPr>
+      <w:r>
+        <w:t>3. Context - For whom/background:</w:t>
+      </w:r>
+    </w:p>
+    <w:p>
+      <w:pPr>
+        <w:pStyle w:val="NoSpacing"/>
+      </w:pPr>
+      <w:r>
+        <w:t>--------------------------------</w:t>
+      </w:r>
+    </w:p>
+    <w:p>
+      <w:pPr>
+        <w:pStyle w:val="NoSpacing"/>
+      </w:pPr>
+      <w:r>
+        <w:t>Background information</w:t>
+      </w:r>
+    </w:p>
+    <w:p>
+      <w:pPr>
+        <w:pStyle w:val="NoSpacing"/>
+      </w:pPr>
+    </w:p>
+    <w:p>
+      <w:pPr>
+        <w:pStyle w:val="NoSpacing"/>
+      </w:pPr>
+      <w:r>
+        <w:t>eg:</w:t>
+      </w:r>
+    </w:p>
+    <w:p>
+      <w:pPr>
+        <w:pStyle w:val="NoSpacing"/>
+      </w:pPr>
+      <w:r>
+        <w:t xml:space="preserve"> For school student</w:t>
+      </w:r>
+    </w:p>
+    <w:p>
+      <w:pPr>
+        <w:pStyle w:val="NoSpacing"/>
+      </w:pPr>
+      <w:r>
+        <w:t xml:space="preserve"> For fresher</w:t>
+      </w:r>
+    </w:p>
+    <w:p>
+      <w:pPr>
+        <w:pStyle w:val="NoSpacing"/>
+      </w:pPr>
+      <w:r>
+        <w:t xml:space="preserve"> For working professional</w:t>
+      </w:r>
+    </w:p>
+    <w:p>
+      <w:pPr>
+        <w:pStyle w:val="NoSpacing"/>
+      </w:pPr>
+      <w:r>
+        <w:t xml:space="preserve"> For business owner</w:t>
+      </w:r>
+    </w:p>
+    <w:p>
+      <w:pPr>
+        <w:pStyle w:val="NoSpacing"/>
+      </w:pPr>
+    </w:p>
+    <w:p>
+      <w:pPr>
+        <w:pStyle w:val="NoSpacing"/>
+      </w:pPr>
+      <w:r>
+        <w:t>Context tells AI level and situation.</w:t>
+      </w:r>
+    </w:p>
+    <w:p>
+      <w:pPr>
+        <w:pStyle w:val="NoSpacing"/>
+      </w:pPr>
+    </w:p>
+    <w:p>
+      <w:pPr>
+        <w:pStyle w:val="NoSpacing"/>
+      </w:pPr>
+    </w:p>
+    <w:p>
+      <w:pPr>
+        <w:pStyle w:val="NoSpacing"/>
+      </w:pPr>
+      <w:r>
+        <w:t>4. Constraints- Rules and Limits:</w:t>
+      </w:r>
+    </w:p>
+    <w:p>
+      <w:pPr>
+        <w:pStyle w:val="NoSpacing"/>
+      </w:pPr>
+      <w:r>
+        <w:t>--------------------------------</w:t>
+      </w:r>
+    </w:p>
+    <w:p>
+      <w:pPr>
+        <w:pStyle w:val="NoSpacing"/>
+      </w:pPr>
+      <w:r>
+        <w:t>means restrictions or conditions</w:t>
+      </w:r>
+    </w:p>
+    <w:p>
+      <w:pPr>
+        <w:pStyle w:val="NoSpacing"/>
+      </w:pPr>
+    </w:p>
+    <w:p>
+      <w:pPr>
+        <w:pStyle w:val="NoSpacing"/>
+      </w:pPr>
+      <w:r>
+        <w:t>eg:</w:t>
+      </w:r>
+    </w:p>
+    <w:p>
+      <w:pPr>
+        <w:pStyle w:val="NoSpacing"/>
+      </w:pPr>
+      <w:r>
+        <w:t xml:space="preserve">   use simple english</w:t>
+      </w:r>
+    </w:p>
+    <w:p>
+      <w:pPr>
+        <w:pStyle w:val="NoSpacing"/>
+      </w:pPr>
+      <w:r>
+        <w:t xml:space="preserve">   do not use technical words</w:t>
+      </w:r>
+    </w:p>
+    <w:p>
+      <w:pPr>
+        <w:pStyle w:val="NoSpacing"/>
+      </w:pPr>
+      <w:r>
+        <w:t xml:space="preserve">   Answer in 5 points</w:t>
+      </w:r>
+    </w:p>
+    <w:p>
+      <w:pPr>
+        <w:pStyle w:val="NoSpacing"/>
+      </w:pPr>
+      <w:r>
+        <w:t xml:space="preserve">   keep it short</w:t>
+      </w:r>
+    </w:p>
+    <w:p>
+      <w:pPr>
+        <w:pStyle w:val="NoSpacing"/>
+      </w:pPr>
+    </w:p>
+    <w:p>
+      <w:pPr>
+        <w:pStyle w:val="NoSpacing"/>
+      </w:pPr>
+      <w:r>
+        <w:t>constraints control AI behaviour</w:t>
+      </w:r>
+    </w:p>
+    <w:p>
+      <w:pPr>
+        <w:pStyle w:val="NoSpacing"/>
+      </w:pPr>
+    </w:p>
+    <w:p>
+      <w:pPr>
+        <w:pStyle w:val="NoSpacing"/>
+      </w:pPr>
+      <w:r>
+        <w:t>5. Output Format - How answer should look like:</w:t>
+      </w:r>
+    </w:p>
+    <w:p>
+      <w:pPr>
+        <w:pStyle w:val="NoSpacing"/>
+      </w:pPr>
+      <w:r>
+        <w:t>-----------------------------------------------</w:t>
+      </w:r>
+    </w:p>
+    <w:p>
+      <w:pPr>
+        <w:pStyle w:val="NoSpacing"/>
+      </w:pPr>
+      <w:r>
+        <w:t>How do you want the answer?</w:t>
+      </w:r>
+    </w:p>
+    <w:p>
+      <w:pPr>
+        <w:pStyle w:val="NoSpacing"/>
+      </w:pPr>
+    </w:p>
+    <w:p>
+      <w:pPr>
+        <w:pStyle w:val="NoSpacing"/>
+      </w:pPr>
+      <w:r>
+        <w:t>eg:</w:t>
+      </w:r>
+    </w:p>
+    <w:p>
+      <w:pPr>
+        <w:pStyle w:val="NoSpacing"/>
+      </w:pPr>
+      <w:r>
+        <w:t>Bullet points</w:t>
+      </w:r>
+    </w:p>
+    <w:p>
+      <w:pPr>
+        <w:pStyle w:val="NoSpacing"/>
+      </w:pPr>
+      <w:r>
+        <w:t>Table</w:t>
+      </w:r>
+    </w:p>
+    <w:p>
+      <w:pPr>
+        <w:pStyle w:val="NoSpacing"/>
+      </w:pPr>
+      <w:r>
+        <w:t>steps</w:t>
+      </w:r>
+    </w:p>
+    <w:p>
+      <w:pPr>
+        <w:pStyle w:val="NoSpacing"/>
+      </w:pPr>
+      <w:r>
+        <w:t>short paragraph</w:t>
+      </w:r>
+    </w:p>
+    <w:p>
+      <w:pPr>
+        <w:pStyle w:val="NoSpacing"/>
+      </w:pPr>
+    </w:p>
+    <w:p>
+      <w:pPr>
+        <w:pStyle w:val="NoSpacing"/>
+      </w:pPr>
+      <w:r>
+        <w:t>Format gives shape to the output.</w:t>
+      </w:r>
+    </w:p>
+    <w:p>
+      <w:pPr>
+        <w:pStyle w:val="NoSpacing"/>
+      </w:pPr>
+    </w:p>
+    <w:p>
+      <w:pPr>
+        <w:pStyle w:val="NoSpacing"/>
+      </w:pPr>
+    </w:p>
+    <w:p>
+      <w:pPr>
+        <w:pStyle w:val="NoSpacing"/>
+      </w:pPr>
+    </w:p>
+    <w:p>
+      <w:pPr>
+        <w:pStyle w:val="NoSpacing"/>
+      </w:pPr>
+      <w:r>
+        <w:t>Set Role</w:t>
+      </w:r>
+    </w:p>
+    <w:p>
+      <w:pPr>
+        <w:pStyle w:val="NoSpacing"/>
+      </w:pPr>
+      <w:r>
+        <w:t>Set Task</w:t>
+      </w:r>
+    </w:p>
+    <w:p>
+      <w:pPr>
+        <w:pStyle w:val="NoSpacing"/>
+      </w:pPr>
+      <w:r>
+        <w:t>Set Context</w:t>
+      </w:r>
+    </w:p>
+    <w:p>
+      <w:pPr>
+        <w:pStyle w:val="NoSpacing"/>
+      </w:pPr>
+      <w:r>
+        <w:t>Set Constranints</w:t>
+      </w:r>
+    </w:p>
+    <w:p>
+      <w:pPr>
+        <w:pStyle w:val="NoSpacing"/>
+      </w:pPr>
+      <w:r>
+        <w:t>Set Output format</w:t>
+      </w:r>
+    </w:p>
+    <w:p>
+      <w:pPr>
+        <w:pStyle w:val="NoSpacing"/>
+      </w:pPr>
+    </w:p>
+    <w:p>
+      <w:pPr>
+        <w:pStyle w:val="NoSpacing"/>
+      </w:pPr>
+      <w:r>
+        <w:t>eg1: Student Learning</w:t>
+      </w:r>
+    </w:p>
+    <w:p>
+      <w:pPr>
+        <w:pStyle w:val="NoSpacing"/>
+      </w:pPr>
+    </w:p>
+    <w:p>
+      <w:pPr>
+        <w:pStyle w:val="NoSpacing"/>
+      </w:pPr>
+      <w:r>
+        <w:lastRenderedPageBreak/>
+        <w:t>Act as a school teacher</w:t>
+      </w:r>
+    </w:p>
+    <w:p>
+      <w:pPr>
+        <w:pStyle w:val="NoSpacing"/>
+      </w:pPr>
+      <w:r>
+        <w:t>Explain python loops</w:t>
+      </w:r>
+    </w:p>
+    <w:p>
+      <w:pPr>
+        <w:pStyle w:val="NoSpacing"/>
+      </w:pPr>
+      <w:r>
+        <w:t>Audience: beginner student</w:t>
+      </w:r>
+    </w:p>
+    <w:p>
+      <w:pPr>
+        <w:pStyle w:val="NoSpacing"/>
+      </w:pPr>
+      <w:r>
+        <w:t>Use Simple Indian English</w:t>
+      </w:r>
+    </w:p>
+    <w:p>
+      <w:pPr>
+        <w:pStyle w:val="NoSpacing"/>
+      </w:pPr>
+      <w:r>
+        <w:t>Give one daily life example</w:t>
+      </w:r>
+    </w:p>
+    <w:p>
+      <w:pPr>
+        <w:pStyle w:val="NoSpacing"/>
+      </w:pPr>
+    </w:p>
+    <w:p>
+      <w:pPr>
+        <w:pStyle w:val="NoSpacing"/>
+      </w:pPr>
+    </w:p>
+    <w:p>
+      <w:pPr>
+        <w:pStyle w:val="NoSpacing"/>
+      </w:pPr>
+    </w:p>
+    <w:p>
+      <w:pPr>
+        <w:pStyle w:val="NoSpacing"/>
+      </w:pPr>
+      <w:r>
+        <w:t>eg2: Interview Practice</w:t>
+      </w:r>
+    </w:p>
+    <w:p>
+      <w:pPr>
+        <w:pStyle w:val="NoSpacing"/>
+      </w:pPr>
+    </w:p>
+    <w:p>
+      <w:pPr>
+        <w:pStyle w:val="NoSpacing"/>
+      </w:pPr>
+      <w:r>
+        <w:t>Act as an interview person</w:t>
+      </w:r>
+    </w:p>
+    <w:p>
+      <w:pPr>
+        <w:pStyle w:val="NoSpacing"/>
+      </w:pPr>
+      <w:r>
+        <w:t>ask me 5 Java interview questions</w:t>
+      </w:r>
+    </w:p>
+    <w:p>
+      <w:pPr>
+        <w:pStyle w:val="NoSpacing"/>
+      </w:pPr>
+      <w:r>
+        <w:t>Level: fresher</w:t>
+      </w:r>
+    </w:p>
+    <w:p>
+      <w:pPr>
+        <w:pStyle w:val="NoSpacing"/>
+      </w:pPr>
+      <w:r>
+        <w:t>wait for my answer after each question</w:t>
+      </w:r>
+    </w:p>
+    <w:p>
+      <w:pPr>
+        <w:pStyle w:val="NoSpacing"/>
+      </w:pPr>
+    </w:p>
+    <w:p>
+      <w:pPr>
+        <w:pStyle w:val="NoSpacing"/>
+      </w:pPr>
+    </w:p>
+    <w:p>
+      <w:pPr>
+        <w:pStyle w:val="NoSpacing"/>
+      </w:pPr>
+      <w:r>
+        <w:t>Act as Exam Expert</w:t>
+      </w:r>
+    </w:p>
+    <w:p>
+      <w:pPr>
+        <w:pStyle w:val="NoSpacing"/>
+      </w:pPr>
+      <w:r>
+        <w:t>provide me 3 MCQs on prompt engineering</w:t>
+      </w:r>
+    </w:p>
+    <w:p>
+      <w:pPr>
+        <w:pStyle w:val="NoSpacing"/>
+      </w:pPr>
+      <w:r>
+        <w:t>Level: fresher</w:t>
+      </w:r>
+    </w:p>
+    <w:p>
+      <w:pPr>
+        <w:pStyle w:val="NoSpacing"/>
+      </w:pPr>
+      <w:r>
+        <w:t>Ask questions one by one</w:t>
+      </w:r>
+    </w:p>
+    <w:p>
+      <w:pPr>
+        <w:pStyle w:val="NoSpacing"/>
+      </w:pPr>
+      <w:r>
+        <w:t>Wait for my answer for each question</w:t>
+      </w:r>
+    </w:p>
+    <w:p>
+      <w:pPr>
+        <w:pStyle w:val="NoSpacing"/>
+      </w:pPr>
+      <w:r>
+        <w:t>Please validate my answer</w:t>
+      </w:r>
+    </w:p>
+    <w:p>
+      <w:pPr>
+        <w:pStyle w:val="NoSpacing"/>
+      </w:pPr>
+      <w:r>
+        <w:t>provide correct answer with explanation with 3 bullet points</w:t>
+      </w:r>
+    </w:p>
+    <w:p>
+      <w:pPr>
+        <w:pStyle w:val="NoSpacing"/>
+      </w:pPr>
+    </w:p>
+    <w:p>
+      <w:pPr>
+        <w:pStyle w:val="NoSpacing"/>
+      </w:pPr>
+    </w:p>
+    <w:p>
+      <w:pPr>
+        <w:pStyle w:val="NoSpacing"/>
+      </w:pPr>
+      <w:r>
+        <w:t>4. Official Email:</w:t>
+      </w:r>
+    </w:p>
+    <w:p>
+      <w:pPr>
+        <w:pStyle w:val="NoSpacing"/>
+      </w:pPr>
+      <w:r>
+        <w:t>----------------</w:t>
+      </w:r>
+    </w:p>
+    <w:p>
+      <w:pPr>
+        <w:pStyle w:val="NoSpacing"/>
+      </w:pPr>
+    </w:p>
+    <w:p>
+      <w:pPr>
+        <w:pStyle w:val="NoSpacing"/>
+      </w:pPr>
+      <w:r>
+        <w:t>Act as a professional assistant</w:t>
+      </w:r>
+    </w:p>
+    <w:p>
+      <w:pPr>
+        <w:pStyle w:val="NoSpacing"/>
+      </w:pPr>
+      <w:r>
+        <w:t>write email to manager</w:t>
+      </w:r>
+    </w:p>
+    <w:p>
+      <w:pPr>
+        <w:pStyle w:val="NoSpacing"/>
+      </w:pPr>
+      <w:r>
+        <w:t>context: requesting 2 days leave</w:t>
+      </w:r>
+    </w:p>
+    <w:p>
+      <w:pPr>
+        <w:pStyle w:val="NoSpacing"/>
+      </w:pPr>
+      <w:r>
+        <w:t>Tone: polite</w:t>
+      </w:r>
+    </w:p>
+    <w:p>
+      <w:pPr>
+        <w:pStyle w:val="NoSpacing"/>
+      </w:pPr>
+      <w:r>
+        <w:t>keep it short</w:t>
+      </w:r>
+    </w:p>
+    <w:p>
+      <w:pPr>
+        <w:pStyle w:val="NoSpacing"/>
+      </w:pPr>
+    </w:p>
+    <w:p>
+      <w:pPr>
+        <w:pStyle w:val="NoSpacing"/>
+      </w:pPr>
+    </w:p>
+    <w:p>
+      <w:pPr>
+        <w:pStyle w:val="NoSpacing"/>
+      </w:pPr>
+      <w:r>
+        <w:t>please provide email to my manager about 2 days leave</w:t>
+      </w:r>
+    </w:p>
+    <w:p>
+      <w:pPr>
+        <w:pStyle w:val="NoSpacing"/>
+      </w:pPr>
+    </w:p>
+    <w:p>
+      <w:pPr>
+        <w:pStyle w:val="NoSpacing"/>
+      </w:pPr>
+    </w:p>
+    <w:p>
+      <w:pPr>
+        <w:pStyle w:val="NoSpacing"/>
+      </w:pPr>
+      <w:r>
+        <w:t>5. Resume Building:</w:t>
+      </w:r>
+    </w:p>
+    <w:p>
+      <w:pPr>
+        <w:pStyle w:val="NoSpacing"/>
+      </w:pPr>
+      <w:r>
+        <w:t>--------------------</w:t>
+      </w:r>
+    </w:p>
+    <w:p>
+      <w:pPr>
+        <w:pStyle w:val="NoSpacing"/>
+      </w:pPr>
+      <w:r>
+        <w:t>Act as HR.</w:t>
+      </w:r>
+    </w:p>
+    <w:p>
+      <w:pPr>
+        <w:pStyle w:val="NoSpacing"/>
+      </w:pPr>
+      <w:r>
+        <w:t>Create a resume summary</w:t>
+      </w:r>
+    </w:p>
+    <w:p>
+      <w:pPr>
+        <w:pStyle w:val="NoSpacing"/>
+      </w:pPr>
+      <w:r>
+        <w:t>context: Python fresher</w:t>
+      </w:r>
+    </w:p>
+    <w:p>
+      <w:pPr>
+        <w:pStyle w:val="NoSpacing"/>
+      </w:pPr>
+      <w:r>
+        <w:t>Focus on skills and projects</w:t>
+      </w:r>
+    </w:p>
+    <w:p>
+      <w:pPr>
+        <w:pStyle w:val="NoSpacing"/>
+      </w:pPr>
+      <w:r>
+        <w:t>use professional language</w:t>
+      </w:r>
+    </w:p>
+    <w:p>
+      <w:pPr>
+        <w:pStyle w:val="NoSpacing"/>
+      </w:pPr>
+    </w:p>
+    <w:p>
+      <w:pPr>
+        <w:pStyle w:val="NoSpacing"/>
+      </w:pPr>
+    </w:p>
+    <w:p>
+      <w:pPr>
+        <w:pStyle w:val="NoSpacing"/>
+      </w:pPr>
+      <w:r>
+        <w:t>6. Coding Help:</w:t>
+      </w:r>
+    </w:p>
+    <w:p>
+      <w:pPr>
+        <w:pStyle w:val="NoSpacing"/>
+      </w:pPr>
+      <w:r>
+        <w:t>-------------</w:t>
+      </w:r>
+    </w:p>
+    <w:p>
+      <w:pPr>
+        <w:pStyle w:val="NoSpacing"/>
+      </w:pPr>
+      <w:r>
+        <w:t>Act as programming mentor</w:t>
+      </w:r>
+    </w:p>
+    <w:p>
+      <w:pPr>
+        <w:pStyle w:val="NoSpacing"/>
+      </w:pPr>
+      <w:r>
+        <w:lastRenderedPageBreak/>
+        <w:t>Explain if-else in python</w:t>
+      </w:r>
+    </w:p>
+    <w:p>
+      <w:pPr>
+        <w:pStyle w:val="NoSpacing"/>
+      </w:pPr>
+      <w:r>
+        <w:t>Audience: beginner</w:t>
+      </w:r>
+    </w:p>
+    <w:p>
+      <w:pPr>
+        <w:pStyle w:val="NoSpacing"/>
+      </w:pPr>
+      <w:r>
+        <w:t>Explain step by step</w:t>
+      </w:r>
+    </w:p>
+    <w:p>
+      <w:pPr>
+        <w:pStyle w:val="NoSpacing"/>
+      </w:pPr>
+    </w:p>
+    <w:p>
+      <w:pPr>
+        <w:pStyle w:val="NoSpacing"/>
+      </w:pPr>
+    </w:p>
+    <w:p>
+      <w:pPr>
+        <w:pStyle w:val="NoSpacing"/>
+      </w:pPr>
+      <w:r>
+        <w:t>7. Business Marketing:</w:t>
+      </w:r>
+    </w:p>
+    <w:p>
+      <w:pPr>
+        <w:pStyle w:val="NoSpacing"/>
+      </w:pPr>
+      <w:r>
+        <w:t>----------------------</w:t>
+      </w:r>
+    </w:p>
+    <w:p>
+      <w:pPr>
+        <w:pStyle w:val="NoSpacing"/>
+      </w:pPr>
+      <w:r>
+        <w:t>Act as Marketing Expert</w:t>
+      </w:r>
+    </w:p>
+    <w:p>
+      <w:pPr>
+        <w:pStyle w:val="NoSpacing"/>
+      </w:pPr>
+      <w:r>
+        <w:t>Write instagram caption</w:t>
+      </w:r>
+    </w:p>
+    <w:p>
+      <w:pPr>
+        <w:pStyle w:val="NoSpacing"/>
+      </w:pPr>
+      <w:r>
+        <w:t>context: small mobile shop</w:t>
+      </w:r>
+    </w:p>
+    <w:p>
+      <w:pPr>
+        <w:pStyle w:val="NoSpacing"/>
+      </w:pPr>
+      <w:r>
+        <w:t>Tone: friendly</w:t>
+      </w:r>
+    </w:p>
+    <w:p>
+      <w:pPr>
+        <w:pStyle w:val="NoSpacing"/>
+      </w:pPr>
+      <w:r>
+        <w:t>Add call to action</w:t>
+      </w:r>
     </w:p>
     <w:sectPr>
       <w:pgSz w:w="11906" w:h="16838"/>

</xml_diff>